<commit_message>
added TRPO lab 1-4 and IRPODM
</commit_message>
<xml_diff>
--- a/AI/NN2 ЛР1/Lab1_Razuvaev_APIM24.docx
+++ b/AI/NN2 ЛР1/Lab1_Razuvaev_APIM24.docx
@@ -2921,16 +2921,7 @@
           <w:sz w:val="28"/>
           <w:szCs w:val="28"/>
         </w:rPr>
-        <w:t xml:space="preserve">(победа, энергия -160). </w:t>
-      </w:r>
-      <w:r>
-        <w:rPr>
-          <w:rFonts w:ascii="Times New Roman" w:hAnsi="Times New Roman" w:cs="Times New Roman"/>
-          <w:color w:val="000000"/>
-          <w:sz w:val="28"/>
-          <w:szCs w:val="28"/>
-        </w:rPr>
-        <w:t xml:space="preserve">При тестировании вектора </w:t>
+        <w:t xml:space="preserve">(победа, энергия -160). При тестировании вектора </w:t>
       </w:r>
       <w:r>
         <w:rPr>
@@ -2949,6 +2940,51 @@
           <w:sz w:val="28"/>
           <w:szCs w:val="28"/>
         </w:rPr>
+        <w:t xml:space="preserve">0 </w:t>
+      </w:r>
+      <w:r>
+        <w:rPr>
+          <w:rFonts w:ascii="Times New Roman" w:hAnsi="Times New Roman" w:cs="Times New Roman"/>
+          <w:color w:val="000000"/>
+          <w:sz w:val="28"/>
+          <w:szCs w:val="28"/>
+        </w:rPr>
+        <w:t xml:space="preserve">(расматривается ситуация </w:t>
+      </w:r>
+      <w:r>
+        <w:rPr>
+          <w:rFonts w:ascii="Times New Roman" w:hAnsi="Times New Roman" w:cs="Times New Roman"/>
+          <w:color w:val="000000"/>
+          <w:sz w:val="28"/>
+          <w:szCs w:val="28"/>
+        </w:rPr>
+        <w:t>пройгрыша</w:t>
+      </w:r>
+      <w:r>
+        <w:rPr>
+          <w:rFonts w:ascii="Times New Roman" w:hAnsi="Times New Roman" w:cs="Times New Roman"/>
+          <w:color w:val="000000"/>
+          <w:sz w:val="28"/>
+          <w:szCs w:val="28"/>
+        </w:rPr>
+        <w:t>)</w:t>
+      </w:r>
+      <w:r>
+        <w:rPr>
+          <w:rFonts w:ascii="Times New Roman" w:hAnsi="Times New Roman" w:cs="Times New Roman"/>
+          <w:color w:val="000000"/>
+          <w:sz w:val="28"/>
+          <w:szCs w:val="28"/>
+        </w:rPr>
+        <w:t xml:space="preserve"> результирующий вектор </w:t>
+      </w:r>
+      <w:r>
+        <w:rPr>
+          <w:rFonts w:ascii="Times New Roman" w:hAnsi="Times New Roman" w:cs="Times New Roman"/>
+          <w:color w:val="000000"/>
+          <w:sz w:val="28"/>
+          <w:szCs w:val="28"/>
+        </w:rPr>
         <w:t>0</w:t>
       </w:r>
       <w:r>
@@ -2959,6 +2995,35 @@
           <w:sz w:val="28"/>
           <w:szCs w:val="28"/>
         </w:rPr>
+        <w:t>1</w:t>
+      </w:r>
+      <w:r>
+        <w:rPr>
+          <w:rFonts w:ascii="Times New Roman" w:hAnsi="Times New Roman" w:cs="Times New Roman"/>
+          <w:color w:val="000000"/>
+          <w:sz w:val="28"/>
+          <w:szCs w:val="28"/>
+        </w:rPr>
+        <w:t>0110101111</w:t>
+      </w:r>
+      <w:r>
+        <w:rPr>
+          <w:rFonts w:ascii="Times New Roman" w:hAnsi="Times New Roman" w:cs="Times New Roman"/>
+          <w:b/>
+          <w:color w:val="000000"/>
+          <w:sz w:val="28"/>
+          <w:szCs w:val="28"/>
+        </w:rPr>
+        <w:t>1</w:t>
+      </w:r>
+      <w:r>
+        <w:rPr>
+          <w:rFonts w:ascii="Times New Roman" w:hAnsi="Times New Roman" w:cs="Times New Roman"/>
+          <w:b/>
+          <w:color w:val="000000"/>
+          <w:sz w:val="28"/>
+          <w:szCs w:val="28"/>
+        </w:rPr>
         <w:t xml:space="preserve"> </w:t>
       </w:r>
       <w:r>
@@ -2968,109 +3033,7 @@
           <w:sz w:val="28"/>
           <w:szCs w:val="28"/>
         </w:rPr>
-        <w:t xml:space="preserve">(расматривается ситуация </w:t>
-      </w:r>
-      <w:r>
-        <w:rPr>
-          <w:rFonts w:ascii="Times New Roman" w:hAnsi="Times New Roman" w:cs="Times New Roman"/>
-          <w:color w:val="000000"/>
-          <w:sz w:val="28"/>
-          <w:szCs w:val="28"/>
-        </w:rPr>
-        <w:t>пройгрыша</w:t>
-      </w:r>
-      <w:r>
-        <w:rPr>
-          <w:rFonts w:ascii="Times New Roman" w:hAnsi="Times New Roman" w:cs="Times New Roman"/>
-          <w:color w:val="000000"/>
-          <w:sz w:val="28"/>
-          <w:szCs w:val="28"/>
-        </w:rPr>
-        <w:t>)</w:t>
-      </w:r>
-      <w:r>
-        <w:rPr>
-          <w:rFonts w:ascii="Times New Roman" w:hAnsi="Times New Roman" w:cs="Times New Roman"/>
-          <w:color w:val="000000"/>
-          <w:sz w:val="28"/>
-          <w:szCs w:val="28"/>
-        </w:rPr>
-        <w:t xml:space="preserve"> результирующий вектор </w:t>
-      </w:r>
-      <w:r>
-        <w:rPr>
-          <w:rFonts w:ascii="Times New Roman" w:hAnsi="Times New Roman" w:cs="Times New Roman"/>
-          <w:color w:val="000000"/>
-          <w:sz w:val="28"/>
-          <w:szCs w:val="28"/>
-        </w:rPr>
-        <w:t>0</w:t>
-      </w:r>
-      <w:r>
-        <w:rPr>
-          <w:rFonts w:ascii="Times New Roman" w:hAnsi="Times New Roman" w:cs="Times New Roman"/>
-          <w:b/>
-          <w:color w:val="000000"/>
-          <w:sz w:val="28"/>
-          <w:szCs w:val="28"/>
-        </w:rPr>
-        <w:t>1</w:t>
-      </w:r>
-      <w:r>
-        <w:rPr>
-          <w:rFonts w:ascii="Times New Roman" w:hAnsi="Times New Roman" w:cs="Times New Roman"/>
-          <w:color w:val="000000"/>
-          <w:sz w:val="28"/>
-          <w:szCs w:val="28"/>
-        </w:rPr>
-        <w:t>0110101111</w:t>
-      </w:r>
-      <w:r>
-        <w:rPr>
-          <w:rFonts w:ascii="Times New Roman" w:hAnsi="Times New Roman" w:cs="Times New Roman"/>
-          <w:b/>
-          <w:color w:val="000000"/>
-          <w:sz w:val="28"/>
-          <w:szCs w:val="28"/>
-        </w:rPr>
-        <w:t>1</w:t>
-      </w:r>
-      <w:r>
-        <w:rPr>
-          <w:rFonts w:ascii="Times New Roman" w:hAnsi="Times New Roman" w:cs="Times New Roman"/>
-          <w:b/>
-          <w:color w:val="000000"/>
-          <w:sz w:val="28"/>
-          <w:szCs w:val="28"/>
-        </w:rPr>
-        <w:t xml:space="preserve"> </w:t>
-      </w:r>
-      <w:r>
-        <w:rPr>
-          <w:rFonts w:ascii="Times New Roman" w:hAnsi="Times New Roman" w:cs="Times New Roman"/>
-          <w:color w:val="000000"/>
-          <w:sz w:val="28"/>
-          <w:szCs w:val="28"/>
-        </w:rPr>
-        <w:t>(победа, энергия -1</w:t>
-      </w:r>
-      <w:r>
-        <w:rPr>
-          <w:rFonts w:ascii="Times New Roman" w:hAnsi="Times New Roman" w:cs="Times New Roman"/>
-          <w:color w:val="000000"/>
-          <w:sz w:val="28"/>
-          <w:szCs w:val="28"/>
-        </w:rPr>
-        <w:t>39</w:t>
-      </w:r>
-      <w:r>
-        <w:rPr>
-          <w:rFonts w:ascii="Times New Roman" w:hAnsi="Times New Roman" w:cs="Times New Roman"/>
-          <w:color w:val="000000"/>
-          <w:sz w:val="28"/>
-          <w:szCs w:val="28"/>
-        </w:rPr>
-        <w:t>)</w:t>
+        <w:t>(победа, энергия -139)</w:t>
       </w:r>
       <w:r>
         <w:rPr>
@@ -3202,43 +3165,7 @@
           <w:sz w:val="24"/>
           <w:szCs w:val="28"/>
         </w:rPr>
-        <w:t xml:space="preserve">Тестирование </w:t>
-      </w:r>
-      <w:r>
-        <w:rPr>
-          <w:rFonts w:ascii="Times New Roman" w:hAnsi="Times New Roman" w:cs="Times New Roman"/>
-          <w:iCs/>
-          <w:sz w:val="24"/>
-          <w:szCs w:val="28"/>
-        </w:rPr>
-        <w:t>нейронн</w:t>
-      </w:r>
-      <w:r>
-        <w:rPr>
-          <w:rFonts w:ascii="Times New Roman" w:hAnsi="Times New Roman" w:cs="Times New Roman"/>
-          <w:iCs/>
-          <w:sz w:val="24"/>
-          <w:szCs w:val="28"/>
-        </w:rPr>
-        <w:t>ой</w:t>
-      </w:r>
-      <w:r>
-        <w:rPr>
-          <w:rFonts w:ascii="Times New Roman" w:hAnsi="Times New Roman" w:cs="Times New Roman"/>
-          <w:iCs/>
-          <w:sz w:val="24"/>
-          <w:szCs w:val="28"/>
-        </w:rPr>
-        <w:t xml:space="preserve"> сет</w:t>
-      </w:r>
-      <w:r>
-        <w:rPr>
-          <w:rFonts w:ascii="Times New Roman" w:hAnsi="Times New Roman" w:cs="Times New Roman"/>
-          <w:iCs/>
-          <w:sz w:val="24"/>
-          <w:szCs w:val="28"/>
-        </w:rPr>
-        <w:t>и</w:t>
+        <w:t>Тестирование нейронной сети</w:t>
       </w:r>
     </w:p>
     <w:p>
@@ -3373,18 +3300,7 @@
           <w:sz w:val="28"/>
           <w:szCs w:val="28"/>
         </w:rPr>
-        <w:t xml:space="preserve"> (победа) со значением энергии -128). </w:t>
-      </w:r>
-      <w:bookmarkStart w:id="5" w:name="_GoBack"/>
-      <w:bookmarkEnd w:id="5"/>
-      <w:r>
-        <w:rPr>
-          <w:rFonts w:ascii="Times New Roman" w:hAnsi="Times New Roman" w:cs="Times New Roman"/>
-          <w:color w:val="000000"/>
-          <w:sz w:val="28"/>
-          <w:szCs w:val="28"/>
-        </w:rPr>
-        <w:t>При этом значении достигается минимум энергии нейронной сети.</w:t>
+        <w:t xml:space="preserve"> (победа) со значением энергии -128). При этом значении достигается минимум энергии нейронной сети.</w:t>
       </w:r>
     </w:p>
     <w:p>
@@ -3399,10 +3315,56 @@
           <w:szCs w:val="28"/>
         </w:rPr>
       </w:pPr>
+      <w:r>
+        <w:rPr>
+          <w:rFonts w:ascii="Times New Roman" w:hAnsi="Times New Roman" w:cs="Times New Roman"/>
+          <w:color w:val="000000"/>
+          <w:sz w:val="28"/>
+          <w:szCs w:val="28"/>
+        </w:rPr>
+        <w:lastRenderedPageBreak/>
+        <w:drawing>
+          <wp:inline distT="0" distB="0" distL="0" distR="0" wp14:anchorId="602BAF5A" wp14:editId="1A8D91B6">
+            <wp:extent cx="5940425" cy="4493260"/>
+            <wp:effectExtent l="0" t="0" r="3175" b="2540"/>
+            <wp:docPr id="2" name="Рисунок 2"/>
+            <wp:cNvGraphicFramePr>
+              <a:graphicFrameLocks xmlns:a="http://schemas.openxmlformats.org/drawingml/2006/main" noChangeAspect="1"/>
+            </wp:cNvGraphicFramePr>
+            <a:graphic xmlns:a="http://schemas.openxmlformats.org/drawingml/2006/main">
+              <a:graphicData uri="http://schemas.openxmlformats.org/drawingml/2006/picture">
+                <pic:pic xmlns:pic="http://schemas.openxmlformats.org/drawingml/2006/picture">
+                  <pic:nvPicPr>
+                    <pic:cNvPr id="1" name=""/>
+                    <pic:cNvPicPr/>
+                  </pic:nvPicPr>
+                  <pic:blipFill>
+                    <a:blip r:embed="rId10"/>
+                    <a:stretch>
+                      <a:fillRect/>
+                    </a:stretch>
+                  </pic:blipFill>
+                  <pic:spPr>
+                    <a:xfrm>
+                      <a:off x="0" y="0"/>
+                      <a:ext cx="5940425" cy="4493260"/>
+                    </a:xfrm>
+                    <a:prstGeom prst="rect">
+                      <a:avLst/>
+                    </a:prstGeom>
+                  </pic:spPr>
+                </pic:pic>
+              </a:graphicData>
+            </a:graphic>
+          </wp:inline>
+        </w:drawing>
+      </w:r>
+      <w:bookmarkStart w:id="5" w:name="_GoBack"/>
+      <w:bookmarkEnd w:id="5"/>
     </w:p>
     <w:sectPr>
-      <w:footerReference w:type="default" r:id="rId10"/>
-      <w:footerReference w:type="first" r:id="rId11"/>
+      <w:footerReference w:type="default" r:id="rId11"/>
+      <w:footerReference w:type="first" r:id="rId12"/>
       <w:pgSz w:w="11906" w:h="16838"/>
       <w:pgMar w:top="1134" w:right="850" w:bottom="1134" w:left="1701" w:header="708" w:footer="708" w:gutter="0"/>
       <w:cols w:space="708"/>
@@ -3468,7 +3430,7 @@
           <w:rPr>
             <w:noProof/>
           </w:rPr>
-          <w:t>6</w:t>
+          <w:t>7</w:t>
         </w:r>
         <w:r>
           <w:fldChar w:fldCharType="end"/>
@@ -8395,7 +8357,7 @@
 </file>
 
 <file path=customXml/itemProps1.xml><?xml version="1.0" encoding="utf-8"?>
-<ds:datastoreItem xmlns:ds="http://schemas.openxmlformats.org/officeDocument/2006/customXml" ds:itemID="{E00433BC-9646-4C47-9A7A-F25201BAD53B}">
+<ds:datastoreItem xmlns:ds="http://schemas.openxmlformats.org/officeDocument/2006/customXml" ds:itemID="{6E5100E9-E938-4969-99A2-FE8FFFBC28B1}">
   <ds:schemaRefs>
     <ds:schemaRef ds:uri="http://schemas.openxmlformats.org/officeDocument/2006/bibliography"/>
   </ds:schemaRefs>

</xml_diff>